<commit_message>
fix: sync manuscript numbers after data-integrity audit
Correct stale numbers that drifted when A*24:02 pan16 was corrected (0.72->0.76,
~11/15->12/15) plus pre-correction values in README/CLAUDE.md/Table3:
- pan16 prose ~11/15 -> 12/15; B*07:02 0.60->0.64; A*24:02 0.72->0.76
- IEDB 93.9% (46/49) -> 95.8% (46/48); AUC 0.947->0.953; n 5,088->5,190
- MHCflurry 2.2.0->2.2.1 (installed); CNN best, not "Deep FFN best"
- companion NetMHCpan "blocked by DTU license" -> IEDB-API single-allele note
- regenerate manuscript.pdf / companion_manuscript.pdf / companion docx

Co-Authored-By: Claude Code <noreply@anthropic.com>
</commit_message>
<xml_diff>
--- a/06_Bioinformatics_Submission/companion_manuscript.docx
+++ b/06_Bioinformatics_Submission/companion_manuscript.docx
@@ -23,34 +23,54 @@
         <w:t xml:space="preserve">Authors</w:t>
       </w:r>
       <w:r>
-        <w:t xml:space="preserve">: Zhuha Zhou</w:t>
-      </w:r>
-      <w:r>
-        <w:t xml:space="preserve">1,†,*</w:t>
+        <w:t xml:space="preserve">: Yunshi Huang</w:t>
+      </w:r>
+      <w:r>
+        <w:t xml:space="preserve">1,†</w:t>
       </w:r>
       <w:r>
         <w:t xml:space="preserve">, Weisheng Chen</w:t>
       </w:r>
       <w:r>
-        <w:t xml:space="preserve">1,†</w:t>
+        <w:t xml:space="preserve">2,†</w:t>
       </w:r>
       <w:r>
         <w:t xml:space="preserve">, Yiqi Cai</w:t>
       </w:r>
       <w:r>
-        <w:t xml:space="preserve">1</w:t>
-      </w:r>
-      <w:r>
-        <w:t xml:space="preserve">, Yongyu Bai</w:t>
-      </w:r>
-      <w:r>
-        <w:t xml:space="preserve">1</w:t>
+        <w:t xml:space="preserve">2</w:t>
+      </w:r>
+      <w:r>
+        <w:t xml:space="preserve">, Xiaopeng Zhuang</w:t>
+      </w:r>
+      <w:r>
+        <w:t xml:space="preserve">2</w:t>
       </w:r>
       <w:r>
         <w:t xml:space="preserve">, Zhuxian Zhou</w:t>
       </w:r>
       <w:r>
-        <w:t xml:space="preserve">2,^</w:t>
+        <w:t xml:space="preserve">3</w:t>
+      </w:r>
+      <w:r>
+        <w:t xml:space="preserve">, Xiangyang Xue</w:t>
+      </w:r>
+      <w:r>
+        <w:t xml:space="preserve">4,</w:t>
+      </w:r>
+      <w:r>
+        <w:rPr>
+          <w:i/>
+          <w:iCs/>
+        </w:rPr>
+        <w:t xml:space="preserve">, Zhuha Zhou</w:t>
+      </w:r>
+      <w:r>
+        <w:rPr>
+          <w:i/>
+          <w:iCs/>
+        </w:rPr>
+        <w:t xml:space="preserve">2,</w:t>
       </w:r>
     </w:p>
     <w:p>
@@ -77,13 +97,25 @@
         <w:t xml:space="preserve"> </w:t>
       </w:r>
       <w:r>
+        <w:t xml:space="preserve">Department of General Surgery, The First Affiliated Hospital of Wenzhou Medical University, Wenzhou, China</w:t>
+      </w:r>
+      <w:r>
+        <w:br/>
+      </w:r>
+      <w:r>
+        <w:t xml:space="preserve">2</w:t>
+      </w:r>
+      <w:r>
+        <w:t xml:space="preserve"> </w:t>
+      </w:r>
+      <w:r>
         <w:t xml:space="preserve">Department of Gastroenterology Surgery, The First Affiliated Hospital of Wenzhou Medical University, Nanbaixiang Street, Ouhai District, 325000 Wenzhou, Zhejiang, China</w:t>
       </w:r>
       <w:r>
         <w:br/>
       </w:r>
       <w:r>
-        <w:t xml:space="preserve">2</w:t>
+        <w:t xml:space="preserve">3</w:t>
       </w:r>
       <w:r>
         <w:t xml:space="preserve"> </w:t>
@@ -91,6 +123,18 @@
       <w:r>
         <w:t xml:space="preserve">Center for Bionanoengineering, College of Chemical and Biological Engineering, Zhejiang University, Hangzhou 310027, China</w:t>
       </w:r>
+      <w:r>
+        <w:br/>
+      </w:r>
+      <w:r>
+        <w:t xml:space="preserve">4</w:t>
+      </w:r>
+      <w:r>
+        <w:t xml:space="preserve"> </w:t>
+      </w:r>
+      <w:r>
+        <w:t xml:space="preserve">Zhejiang Key Laboratory of Intelligent Cancer Biomarker Discovery and Translation, The First Affiliated Hospital of Wenzhou Medical University, Wenzhou, China</w:t>
+      </w:r>
     </w:p>
     <w:p>
       <w:pPr>
@@ -115,19 +159,7 @@
         <w:t xml:space="preserve"> </w:t>
       </w:r>
       <w:r>
-        <w:t xml:space="preserve">Corresponding author: Zhuha Zhou, zhouzhuha@wmu.edu.cn, ORCID: 0009-0005-1818-4789</w:t>
-      </w:r>
-      <w:r>
-        <w:br/>
-      </w:r>
-      <w:r>
-        <w:t xml:space="preserve">^</w:t>
-      </w:r>
-      <w:r>
-        <w:t xml:space="preserve"> </w:t>
-      </w:r>
-      <w:r>
-        <w:t xml:space="preserve">Zhuxian Zhou, zhouzx@zju.edu.cn</w:t>
+        <w:t xml:space="preserve">Corresponding authors: Xiangyang Xue, wzxxy@wmu.edu.cn, ORCID: 0000-0002-8670-2016; Zhuha Zhou, zhouzhuha@wmu.edu.cn, ORCID: 0009-0005-1818-4789</w:t>
       </w:r>
     </w:p>
     <w:p>
@@ -151,7 +183,7 @@
         <w:pStyle w:val="FirstParagraph"/>
       </w:pPr>
       <w:r>
-        <w:t xml:space="preserve">Peptide binding to MHC class I is the gatekeeper of CD8+ T-cell recognition, and pan-specific predictors have become the field standard for multi-allele screening. Two questions remain open: whether a single sequence-based pan model can match per-allele specialists, and how hard non-canonical (motif-failing) binders are for current prediction methods — including structure-based approaches. We benchmarked a rebalanced pan-specific deep feed-forward network (DFFN) across five common HLA-I alleles (n = 14,488 curated IEDB positives) and a 15-allele panel, comparing against per-allele models, MHCflurry, and the structure-based predictor MUNIS. Across five seeds, the rebalanced pan model reached non-canonical sensitivity 0.92–1.00, matching per-allele specialists; an apparent per-allele advantage in prior work was a 10.6× training-data-size artifact. On the 15-allele panel, pooled non-canonical sensitivity was 0.819 (12/15 alleles ≥0.76). Canonical binders were recognized at ~0.98 by every predictor class. In contrast, non-canonical (Type B) binders plateaued at ~0.65 sensitivity across DFFN (0.607), MHCflurry (0.668), and MUNIS (0.647) — structure-based prediction did not lift the ceiling. Type A (tolerated weak anchors) binders were inherently hard (0.477) and not recovered by broad-motif retraining. Temporal holdout confirmed preserved recognition of post-2022 epitopes, breaking the label-circularity concern. We conclude that one rebalanced pan model replaces a per-allele panel, and that the canonical binder problem is effectively solved while the non-canonical tail — prediction-resistant to all current methods including structure-based scoring — defines the current frontier.</w:t>
+        <w:t xml:space="preserve">Peptide binding to MHC class I is the gatekeeper of CD8+ T-cell recognition, and pan-specific predictors have become the field standard for multi-allele screening. Two questions remain open: whether a single sequence-based pan model can match per-allele specialists, and how hard non-canonical (motif-failing) binders are for current prediction methods. We benchmarked a rebalanced pan-specific deep feed-forward network (DFFN) across five common HLA-I alleles (n = 14,488 curated IEDB positives) and a 15-allele panel, comparing against per-allele models, MHCflurry, and the sequence-based predictor MUNIS (ESM-2+LSTM). With protein-background negatives, per-allele models reached non-canonical sensitivity 0.84–0.96, and a rebalanced pan model matched them on four of five alleles; B*07:02 was a notable exception (pan 0.60 vs per-allele 0.96, over-anchoring to P2-Proline). An apparent per-allele advantage in prior work was a 10.6× training-data-size artifact. On the 15-allele panel, pooled non-canonical sensitivity was 0.819 (12/15 alleles ≥0.76). Canonical binders were recognized at ~0.98 by every predictor class. In contrast, non-canonical (Type B) binders plateaued at ~0.65 sensitivity across DFFN (0.607), MHCflurry (0.668), and MUNIS (0.647) — a third sequence predictor did not lift the ceiling. Type A (tolerated weak anchors) binders were inherently hard (0.477) and not recovered by broad-motif retraining. Temporal holdout confirmed preserved recognition of post-2022 epitopes, breaking the label-circularity concern. We conclude that a rebalanced pan model matches per-allele specialists on four of five alleles, that the canonical binder problem is effectively solved while the non-canonical tail — prediction-resistant to all three sequence predictors tested — defines the current frontier.</w:t>
       </w:r>
     </w:p>
     <w:p>
@@ -192,7 +224,7 @@
         <w:pStyle w:val="BodyText"/>
       </w:pPr>
       <w:r>
-        <w:t xml:space="preserve">We address these questions through a controlled multi-allele benchmark. A single rebalanced pan DFFN is compared against per-allele specialists, the sequence-based MHCflurry, and the structure-based MUNIS, across five common alleles and a 15-allele panel, with temporal holdout to break label circularity. We find that the rebalanced pan model matches per-allele specialists, that non-canonical binders plateau at ~0.65 sensitivity for every predictor class including structure-based methods, and that the energy-compensated tail is prediction-resistant to all current methods.</w:t>
+        <w:t xml:space="preserve">We address these questions through a controlled multi-allele benchmark. A single rebalanced pan DFFN is compared against per-allele specialists, the sequence-based MHCflurry, and the sequence-based MUNIS (ESM-2+LSTM), across five common alleles and a 15-allele panel, with temporal holdout to break label circularity. We find that the rebalanced pan model matches per-allele specialists, that non-canonical binders plateau at ~0.65 sensitivity for every predictor class (three independent sequence models), and that the energy-compensated tail is prediction-resistant to all current methods.</w:t>
       </w:r>
     </w:p>
     <w:bookmarkEnd w:id="10"/>
@@ -219,7 +251,7 @@
         <w:pStyle w:val="FirstParagraph"/>
       </w:pPr>
       <w:r>
-        <w:t xml:space="preserve">Experimentally confirmed class I binders were curated from the IEDB [9] for five common alleles (HLA-A*02:01, A*01:01, A*03:01, B*07:02, B*44:03), yielding n = 14,488 positives (canonical 11,225; Type A 151; Type B 3,112). A 15-allele panel (pan16: 11 additional alleles — A*11:01, A*24:02, B*08:01, B*15:01, B*27:05, B*35:01, B*40:01, B*49:01, B*51:01, B*57:01) was curated for generalisation testing. Protein-background negatives were sampled from natural proteomes to avoid the uniform-random decoys used in earlier evaluations.</w:t>
+        <w:t xml:space="preserve">Experimentally confirmed class I binders were curated from the IEDB [9] for five common alleles (HLA-A*02:01, A*01:01, A*03:01, B*07:02, B*44:03), yielding n = 14,488 positives (canonical 11,225; Type A 151; Type B 3,112). A 15-allele panel (pan16: 11 additional alleles — A*11:01, A*24:02, B*08:01, B*15:01, B*27:05, B*35:01, B*40:01, B*49:01, B*51:01, B*57:01) was curated for generalisation testing. Protein-background negatives were sampled from natural proteomes to avoid the uniform-random decoys used in earlier evaluations. IEDB data were queried live from query-api.iedb.org (accessed 2026-08-02); the 15-allele and temporal-holdout estimates are therefore snapshot-dependent and drift slightly as the IEDB grows.</w:t>
       </w:r>
     </w:p>
     <w:bookmarkEnd w:id="11"/>
@@ -237,7 +269,7 @@
         <w:pStyle w:val="FirstParagraph"/>
       </w:pPr>
       <w:r>
-        <w:t xml:space="preserve">Type A (tolerated weak anchors) and Type B (energy-compensated non-canonical) were defined by whether the peptide violates the allele’s canonical anchor motif at p2/p9. Type A carries broad-only tolerated anchors (residues that appear in binding motifs but are non-canonical); Type B carries non-canonical residues at anchor positions. This distinction matters because the two classes have different biological origins and, as we show, different prediction difficulty.</w:t>
+        <w:t xml:space="preserve">Type A (tolerated weak anchors) and Type B (energy-compensated non-canonical) were defined by whether the peptide violates the allele’s canonical anchor motif at p2/p9. Type A carries broad-only tolerated anchors (residues that appear in binding motifs but are non-canonical); Type B carries non-canonical residues at anchor positions. The two classes have different biological origins and, as we show, different prediction difficulty.</w:t>
       </w:r>
     </w:p>
     <w:bookmarkEnd w:id="12"/>
@@ -255,7 +287,7 @@
         <w:pStyle w:val="FirstParagraph"/>
       </w:pPr>
       <w:r>
-        <w:t xml:space="preserve">The pan-specific DFFN uses BLOSUM62 encoding [12] through a 360–180–90–45 hidden stack with batch normalisation and dropout. Rebalancing upsampled the minority B*07:02 allele 4× during training to correct for allele-frequency imbalance. Five seeds (0, 1, 42, 123, 2024) were used; per-seed variation arises from data-sampling RNG. Per-allele models (one per allele) and a pan16 model (15 alleles, per-allele minimum 2,000 upsampling) were trained with the same recipe.</w:t>
+        <w:t xml:space="preserve">The pan-specific DFFN uses BLOSUM62 encoding [10] through a 360–180–90–45 hidden stack with batch normalisation and dropout. Rebalancing upsampled the minority B*07:02 allele 4× during training to correct for allele-frequency imbalance. Five seeds (0, 1, 42, 123, 2024) were used; per-seed variation arises from data-sampling RNG. Per-allele models (one per allele) and a pan16 model (15 alleles, per-allele minimum 2,000 upsampling) were trained with the same recipe.</w:t>
       </w:r>
     </w:p>
     <w:bookmarkEnd w:id="13"/>
@@ -273,7 +305,7 @@
         <w:pStyle w:val="FirstParagraph"/>
       </w:pPr>
       <w:r>
-        <w:t xml:space="preserve">MHCflurry 2.2.1 [5] served as an independent sequence predictor (affinity threshold 500 nM). MUNIS [7] — a structure-based pMHC-I predictor using ESM-2 embeddings [10] and AlphaFold-Multimer-style structure scoring with no-flank checkpoints — served as the structure-conditioned comparator, run on the n = 3,112 Type B population plus canonical controls.</w:t>
+        <w:t xml:space="preserve">MHCflurry 2.2.1 [5] served as an independent sequence predictor (affinity threshold 500 nM). MUNIS [7] — a second sequence-based predictor using ESM-2 embeddings [11] — served as an independent sequence comparator, run on the n = 3,112 Type B population plus canonical controls.</w:t>
       </w:r>
     </w:p>
     <w:bookmarkEnd w:id="14"/>
@@ -291,7 +323,7 @@
         <w:pStyle w:val="FirstParagraph"/>
       </w:pPr>
       <w:r>
-        <w:t xml:space="preserve">To address label circularity [11], IEDB epitopes published after 2022 (post-2022, unseen by MHCflurry’s ~pre-2021 training data) were compared against pre-2021 (in-distribution) epitopes at sensitivity threshold 0.95.</w:t>
+        <w:t xml:space="preserve">To address label circularity [12], IEDB epitopes published after 2022 (post-2022, unseen by MHCflurry’s ~pre-2021 training data) were compared against pre-2021 (in-distribution) epitopes at sensitivity threshold 0.95.</w:t>
       </w:r>
     </w:p>
     <w:bookmarkEnd w:id="15"/>
@@ -323,13 +355,13 @@
         <w:t xml:space="preserve">3 Results</w:t>
       </w:r>
     </w:p>
-    <w:bookmarkStart w:id="18" w:name="X8b2e19f7e724350e57bab1678338af695bcc8c1"/>
+    <w:bookmarkStart w:id="18" w:name="Xc086741a7b3a90d9524c358a03bf3e0111acdb3"/>
     <w:p>
       <w:pPr>
         <w:pStyle w:val="Heading3"/>
       </w:pPr>
       <w:r>
-        <w:t xml:space="preserve">3.1 A rebalanced pan model matches per-allele specialists</w:t>
+        <w:t xml:space="preserve">3.1 A rebalanced pan model matches per-allele specialists on four of five alleles</w:t>
       </w:r>
     </w:p>
     <w:p>
@@ -337,7 +369,7 @@
         <w:pStyle w:val="FirstParagraph"/>
       </w:pPr>
       <w:r>
-        <w:t xml:space="preserve">Across five seeds, the rebalanced pan DFFN reached non-canonical sensitivity (mean ± SD): A*02:01 0.98 ± 0.02, A*01:01 0.92 ± 0.04, A*03:01 0.98 ± 0.02, B*07:02 0.92 ± 0.05, B*44:03 1.00 ± 0.00 (Table 1; Figure 1). These values are at or above the corresponding per-allele models, so a single model replaces five. The earlier observation that per-allele models outperform pan models on non-canonical binders is not supported once per-allele training-data size is controlled.</w:t>
+        <w:t xml:space="preserve">With protein-background negatives and a fixed threshold (n=25 non-canonical binders per allele), per-allele models reached non-canonical sensitivity A*02:01 0.84, A*01:01 0.88, A*03:01 1.00, B*07:02 0.96, B*44:03 0.96 (Table 1; Figure 1). The rebalanced pan model matched this on four of five alleles (A*02:01 0.84, A*01:01 0.88, A*03:01 1.00, B*44:03 1.00), but B*07:02 was a notable exception: the pan model dropped to 0.60 versus 0.96 per-allele (Wilson 95% CIs [0.41, 0.77] vs [0.81, 0.99], non-overlapping), consistent with over-anchoring to B*07:02’s distinctive P2-Proline. The earlier observation that per-allele models outperform pan models on non-canonical binders is not supported once per-allele training-data size is controlled.</w:t>
       </w:r>
     </w:p>
     <w:p>
@@ -349,7 +381,7 @@
           <w:b/>
           <w:bCs/>
         </w:rPr>
-        <w:t xml:space="preserve">Table 1. Rebalanced pan non-canonical sensitivity by allele (5-seed mean ± SD,</w:t>
+        <w:t xml:space="preserve">Table 1. Non-canonical sensitivity by allele (protein-background negatives, n=25 per allele,</w:t>
       </w:r>
       <w:r>
         <w:rPr>
@@ -407,18 +439,19 @@
               <w:jc w:val="center"/>
             </w:pPr>
             <w:r>
-              <w:t xml:space="preserve">Mean ± SD</w:t>
-            </w:r>
-          </w:p>
-        </w:tc>
-        <w:tc>
-          <w:tcPr/>
-          <w:p>
-            <w:pPr>
-              <w:pStyle w:val="Compact"/>
-            </w:pPr>
-            <w:r>
-              <w:t xml:space="preserve">Per-seed values</w:t>
+              <w:t xml:space="preserve">Per-allele</w:t>
+            </w:r>
+          </w:p>
+        </w:tc>
+        <w:tc>
+          <w:tcPr/>
+          <w:p>
+            <w:pPr>
+              <w:pStyle w:val="Compact"/>
+              <w:jc w:val="center"/>
+            </w:pPr>
+            <w:r>
+              <w:t xml:space="preserve">Pan</w:t>
             </w:r>
           </w:p>
         </w:tc>
@@ -443,18 +476,19 @@
               <w:jc w:val="center"/>
             </w:pPr>
             <w:r>
-              <w:t xml:space="preserve">0.98 ± 0.02</w:t>
-            </w:r>
-          </w:p>
-        </w:tc>
-        <w:tc>
-          <w:tcPr/>
-          <w:p>
-            <w:pPr>
-              <w:pStyle w:val="Compact"/>
-            </w:pPr>
-            <w:r>
-              <w:t xml:space="preserve">1.0, 1.0, 1.0, 0.96, 0.96</w:t>
+              <w:t xml:space="preserve">0.84</w:t>
+            </w:r>
+          </w:p>
+        </w:tc>
+        <w:tc>
+          <w:tcPr/>
+          <w:p>
+            <w:pPr>
+              <w:pStyle w:val="Compact"/>
+              <w:jc w:val="center"/>
+            </w:pPr>
+            <w:r>
+              <w:t xml:space="preserve">0.84</w:t>
             </w:r>
           </w:p>
         </w:tc>
@@ -479,18 +513,19 @@
               <w:jc w:val="center"/>
             </w:pPr>
             <w:r>
-              <w:t xml:space="preserve">0.92 ± 0.04</w:t>
-            </w:r>
-          </w:p>
-        </w:tc>
-        <w:tc>
-          <w:tcPr/>
-          <w:p>
-            <w:pPr>
-              <w:pStyle w:val="Compact"/>
-            </w:pPr>
-            <w:r>
-              <w:t xml:space="preserve">0.92, 0.92, 0.96, 0.84, 0.96</w:t>
+              <w:t xml:space="preserve">0.88</w:t>
+            </w:r>
+          </w:p>
+        </w:tc>
+        <w:tc>
+          <w:tcPr/>
+          <w:p>
+            <w:pPr>
+              <w:pStyle w:val="Compact"/>
+              <w:jc w:val="center"/>
+            </w:pPr>
+            <w:r>
+              <w:t xml:space="preserve">0.88</w:t>
             </w:r>
           </w:p>
         </w:tc>
@@ -515,18 +550,19 @@
               <w:jc w:val="center"/>
             </w:pPr>
             <w:r>
-              <w:t xml:space="preserve">0.98 ± 0.02</w:t>
-            </w:r>
-          </w:p>
-        </w:tc>
-        <w:tc>
-          <w:tcPr/>
-          <w:p>
-            <w:pPr>
-              <w:pStyle w:val="Compact"/>
-            </w:pPr>
-            <w:r>
-              <w:t xml:space="preserve">1.0, 0.96, 1.0, 0.96, 0.96</w:t>
+              <w:t xml:space="preserve">1.00</w:t>
+            </w:r>
+          </w:p>
+        </w:tc>
+        <w:tc>
+          <w:tcPr/>
+          <w:p>
+            <w:pPr>
+              <w:pStyle w:val="Compact"/>
+              <w:jc w:val="center"/>
+            </w:pPr>
+            <w:r>
+              <w:t xml:space="preserve">1.00</w:t>
             </w:r>
           </w:p>
         </w:tc>
@@ -551,18 +587,23 @@
               <w:jc w:val="center"/>
             </w:pPr>
             <w:r>
-              <w:t xml:space="preserve">0.92 ± 0.05</w:t>
-            </w:r>
-          </w:p>
-        </w:tc>
-        <w:tc>
-          <w:tcPr/>
-          <w:p>
-            <w:pPr>
-              <w:pStyle w:val="Compact"/>
-            </w:pPr>
-            <w:r>
-              <w:t xml:space="preserve">0.92, 0.92, 0.84, 0.92, 1.0</w:t>
+              <w:t xml:space="preserve">0.96</w:t>
+            </w:r>
+          </w:p>
+        </w:tc>
+        <w:tc>
+          <w:tcPr/>
+          <w:p>
+            <w:pPr>
+              <w:pStyle w:val="Compact"/>
+              <w:jc w:val="center"/>
+            </w:pPr>
+            <w:r>
+              <w:rPr>
+                <w:b/>
+                <w:bCs/>
+              </w:rPr>
+              <w:t xml:space="preserve">0.60</w:t>
             </w:r>
           </w:p>
         </w:tc>
@@ -587,18 +628,19 @@
               <w:jc w:val="center"/>
             </w:pPr>
             <w:r>
-              <w:t xml:space="preserve">1.00 ± 0.00</w:t>
-            </w:r>
-          </w:p>
-        </w:tc>
-        <w:tc>
-          <w:tcPr/>
-          <w:p>
-            <w:pPr>
-              <w:pStyle w:val="Compact"/>
-            </w:pPr>
-            <w:r>
-              <w:t xml:space="preserve">1.0, 1.0, 1.0, 1.0, 1.0</w:t>
+              <w:t xml:space="preserve">0.96</w:t>
+            </w:r>
+          </w:p>
+        </w:tc>
+        <w:tc>
+          <w:tcPr/>
+          <w:p>
+            <w:pPr>
+              <w:pStyle w:val="Compact"/>
+              <w:jc w:val="center"/>
+            </w:pPr>
+            <w:r>
+              <w:t xml:space="preserve">1.00</w:t>
             </w:r>
           </w:p>
         </w:tc>
@@ -637,7 +679,7 @@
         <w:pStyle w:val="FirstParagraph"/>
       </w:pPr>
       <w:r>
-        <w:t xml:space="preserve">On n = 3,112 Type B positives, sensitivity was DFFN 0.607, MHCflurry 0.668, MUNIS 0.647 (Table 2; Figure 2). The three values are statistically indistinguishable (overlapping Wilson CIs); structure-based prediction does not lift the ceiling.</w:t>
+        <w:t xml:space="preserve">On n = 3,112 Type B positives, sensitivity was DFFN 0.607, MHCflurry 0.668, MUNIS 0.647 (Table 2; Figure 2). The three values fall within a narrow band (0.607–0.668), far below the ~0.98 canonical sensitivity; a third sequence predictor does not lift the ceiling.</w:t>
       </w:r>
     </w:p>
     <w:p>
@@ -822,7 +864,7 @@
               <w:pStyle w:val="Compact"/>
             </w:pPr>
             <w:r>
-              <w:t xml:space="preserve">MUNIS (structure)</w:t>
+              <w:t xml:space="preserve">MUNIS (sequence)</w:t>
             </w:r>
           </w:p>
         </w:tc>
@@ -1121,19 +1163,7 @@
         <w:pStyle w:val="FirstParagraph"/>
       </w:pPr>
       <w:r>
-        <w:t xml:space="preserve">The three false negatives from our single-allele IEDB benchmark (</w:t>
-      </w:r>
-      <w:r>
-        <w:rPr>
-          <w:rStyle w:val="VerbatimChar"/>
-        </w:rPr>
-        <w:t xml:space="preserve">ILRGSVAHK</w:t>
-      </w:r>
-      <w:r>
-        <w:t xml:space="preserve">,</w:t>
-      </w:r>
-      <w:r>
-        <w:t xml:space="preserve"> </w:t>
+        <w:t xml:space="preserve">The two false negatives from our single-allele IEDB benchmark (</w:t>
       </w:r>
       <w:r>
         <w:rPr>
@@ -1211,7 +1241,7 @@
         <w:t xml:space="preserve">@0.95</w:t>
       </w:r>
       <w:r>
-        <w:t xml:space="preserve">), with 12/15 alleles at 0.76–1.0 (Table 4; Figure 3). The weak tail — B*27:05 at 0.08 with only 150 samples, B*51:01 at 0.52 with 1,665 — reflects data scarcity, not architecture.</w:t>
+        <w:t xml:space="preserve">), with 12/15 alleles at 0.76–1.0 (Table 4; Figure 3). The weak tail — B*27:05 (0.08–0.20), B*51:01 (0.36–0.52), B*07:02 (0.64), A*24:02 (0.76) — reflects data scarcity and, for B*07:02, over-anchoring, not architecture.</w:t>
       </w:r>
     </w:p>
     <w:p>
@@ -1820,7 +1850,7 @@
         <w:pStyle w:val="FirstParagraph"/>
       </w:pPr>
       <w:r>
-        <w:t xml:space="preserve">Post-2022 epitopes (unseen by the labeler) were recognized at sens@0.95: A*02:01 0.824, A*03:01 0.936, B*07:02 0.973 — preserved versus pre-2021 (0.879/0.905/0.898), with A*03:01 and B*07:02 improving (Table 5; Figure 4). The model is not overfit to a single training-data era.</w:t>
+        <w:t xml:space="preserve">Post-2022 epitopes (unseen by the labeler) were recognized at sens@0.95: A*02:01 0.824, A*03:01 0.936, B*07:02 0.973 — preserved versus pre-2021 (0.879/0.905/0.898), with no systematic drop in the post-2022 era (Table 5; Figure 4). The model is not overfit to a single training-data era.</w:t>
       </w:r>
     </w:p>
     <w:p>
@@ -2028,7 +2058,7 @@
         <w:pStyle w:val="FirstParagraph"/>
       </w:pPr>
       <w:r>
-        <w:t xml:space="preserve">Three findings emerge. First, a positive, replicable result: a single rebalanced pan-specific DFFN reaches parity with per-allele specialists across five alleles (and 0.819 pooled across 15), approximating NetMHCpan’s practical value with a simple, reproducible recipe. The naive</w:t>
+        <w:t xml:space="preserve">Three findings emerge. First, a positive, replicable result: a single rebalanced pan-specific DFFN reaches parity with per-allele specialists on four of five alleles (B*07:02 excepted; and 0.819 pooled across 15), approximating NetMHCpan’s practical value with a simple, reproducible recipe. The naive</w:t>
       </w:r>
       <w:r>
         <w:t xml:space="preserve"> </w:t>
@@ -2048,7 +2078,7 @@
         <w:pStyle w:val="BodyText"/>
       </w:pPr>
       <w:r>
-        <w:t xml:space="preserve">Second, a negative, cross-predictor result: non-canonical (Type B) binders plateau at ~0.65 sensitivity regardless of whether the predictor uses sequence or structure. The field’s assumption that structure-based scoring will rescue what sequence models miss [8] is directly challenged by the MUNIS measurement: a structure-based predictor achieves the same sensitivity ceiling as sequence-based methods. Structure-based scoring may still add value for the hardest cases, but it does not currently lift the aggregate plateau.</w:t>
+        <w:t xml:space="preserve">Second, a negative, cross-predictor result: non-canonical (Type B) binders plateau at ~0.65 sensitivity across three independent sequence-based predictors (our DFFN, MHCflurry, MUNIS), so the ceiling is shared across sequence architectures of varying complexity rather than specific to our simple network. Whether structure-based scoring (e.g. structure-guided diffusion models [8]) can lift this ceiling remains open — it was not benchmarked here at scale.</w:t>
       </w:r>
     </w:p>
     <w:p>
@@ -2056,7 +2086,7 @@
         <w:pStyle w:val="BodyText"/>
       </w:pPr>
       <w:r>
-        <w:t xml:space="preserve">Third, a caveat that strengthens the structural story: the extreme energy-compensated tail (P2-Lys/Arg/His reaching B-pocket Glu63; Zhou et al., companion) is prediction-resistant to every method tested, yet structure-informed analysis predicts these peptides bind. The contrast argues for structure-based screening as a complement for the hardest cases, pending experimental validation.</w:t>
+        <w:t xml:space="preserve">Third, the extreme energy-compensated tail (P2-Lys/Arg/His reaching B-pocket Glu63; Zhou et al., companion) is prediction-resistant to every method tested, yet structure-informed analysis predicts these peptides bind. The contrast argues for structure-based screening as a complement for the hardest cases, pending experimental validation.</w:t>
       </w:r>
     </w:p>
     <w:bookmarkStart w:id="26" w:name="methodological-implications"/>
@@ -2085,7 +2115,7 @@
         <w:t xml:space="preserve"> </w:t>
       </w:r>
       <w:r>
-        <w:t xml:space="preserve">on non-canonical binders (A*03:01 at 0.48); retraining on equalized data restored parity (0.98). We recommend that model comparisons control for training-data size and report seed-robust estimates, protein-background negatives, and fixed thresholds as standard practice.</w:t>
+        <w:t xml:space="preserve">on non-canonical binders (A*03:01 at 0.48); retraining on equalized data restored parity (A*03:01 at 1.0). We recommend that model comparisons control for training-data size and report seed-robust estimates, protein-background negatives, and fixed thresholds as standard practice.</w:t>
       </w:r>
     </w:p>
     <w:bookmarkEnd w:id="26"/>
@@ -2119,7 +2149,7 @@
         </w:numPr>
       </w:pPr>
       <w:r>
-        <w:t xml:space="preserve">A pMHC-fine-tuned structure model (beyond generic AlphaFold-Multimer) might lift the Type B plateau; MUNIS is a strong but not definitive structural comparator.</w:t>
+        <w:t xml:space="preserve">A pMHC-fine-tuned structure model (beyond generic AlphaFold-Multimer) might lift the Type B plateau; MUNIS is a sequence-based comparator and does not speak to this.</w:t>
       </w:r>
     </w:p>
     <w:p>
@@ -2143,7 +2173,7 @@
         </w:numPr>
       </w:pPr>
       <w:r>
-        <w:t xml:space="preserve">NetMHCpan comparison was blocked by the DTU license; MHCflurry and MUNIS served as independent sequence and structure predictors.</w:t>
+        <w:t xml:space="preserve">NetMHCpan was not benchmarked on the multi-allele panel; the standalone NetMHCpan download is restricted by the DTU license, while the single-allele NetMHCpan-4.1 comparison (via the IEDB API) is reported in the sister study. MHCflurry and MUNIS served as two independent sequence predictors.</w:t>
       </w:r>
     </w:p>
     <w:bookmarkEnd w:id="27"/>
@@ -2162,7 +2192,7 @@
         <w:pStyle w:val="FirstParagraph"/>
       </w:pPr>
       <w:r>
-        <w:t xml:space="preserve">One rebalanced pan-specific model replaces a per-allele panel. Canonical binding is solved; non-canonical binding defines the frontier, at ~0.65 for all current predictor classes including structure-based methods. Experimental validation of the energy-compensated tail is the decisive next step.</w:t>
+        <w:t xml:space="preserve">A rebalanced pan-specific model matches per-allele specialists on four of five common alleles, with B*07:02 as a notable exception (over-anchoring to P2-Proline). Canonical binding is solved; non-canonical binding defines the frontier, at ~0.65 across three independent sequence-based predictors. Experimental validation of the energy-compensated tail is the decisive next step.</w:t>
       </w:r>
     </w:p>
     <w:bookmarkEnd w:id="29"/>
@@ -2190,7 +2220,7 @@
         <w:t xml:space="preserve"> </w:t>
       </w:r>
       <w:r>
-        <w:t xml:space="preserve">Rebalanced pan model non-canonical sensitivity (5-seed mean ± SD) across five common HLA-I alleles. All five alleles meet or exceed the 0.9 target (dashed line).</w:t>
+        <w:t xml:space="preserve">Non-canonical sensitivity (per-allele vs pan) across five common HLA-I alleles (protein-background negatives). Four of five alleles reach parity; B*07:02 is the exception (pan 0.60 vs per-allele 0.96).</w:t>
       </w:r>
     </w:p>
     <w:p>
@@ -2208,7 +2238,7 @@
         <w:t xml:space="preserve"> </w:t>
       </w:r>
       <w:r>
-        <w:t xml:space="preserve">Predictor plateau: canonical versus Type B (non-canonical) sensitivity for Deep FFN, MHCflurry, and MUNIS (structure); dashed line marks the ~0.65 Type B plateau.</w:t>
+        <w:t xml:space="preserve">Predictor plateau: canonical versus Type B (non-canonical) sensitivity for Deep FFN, MHCflurry, and MUNIS (sequence); dashed line marks the ~0.65 Type B plateau.</w:t>
       </w:r>
     </w:p>
     <w:p>
@@ -2432,7 +2462,7 @@
         </w:numPr>
       </w:pPr>
       <w:r>
-        <w:t xml:space="preserve">Albert BA, Yang Y, Shao XM, et al. BigMHC: deep learning-based prediction of MHC-I epitope presentation. bioRxiv 2023.</w:t>
+        <w:t xml:space="preserve">Albert BA, Yang Y, Shao XM, et al. Deep neural networks predict class I major histocompatibility complex epitope presentation and transfer learn neoepitope immunogenicity. Nat Mach Intell 2023;5:861-872.</w:t>
       </w:r>
     </w:p>
     <w:p>
@@ -2444,7 +2474,7 @@
         </w:numPr>
       </w:pPr>
       <w:r>
-        <w:t xml:space="preserve">Chen B, Khodadoust MS, Olsson N, et al. MUNIS: a deep learning model for predicting MHC-I epitope presentation. Nat Biotechnol 2025;43:123-132.</w:t>
+        <w:t xml:space="preserve">Wohlwend J, Nathan A, Barzilay R, et al. Deep learning enhances the prediction of HLA class I-presented CD8+ T cell epitopes in foreign pathogens. Nat Mach Intell 2025. doi:10.1038/s42256-024-00971-y.</w:t>
       </w:r>
     </w:p>
     <w:p>
@@ -2456,7 +2486,7 @@
         </w:numPr>
       </w:pPr>
       <w:r>
-        <w:t xml:space="preserve">Mares S, Miao Z, Grzeskowiak CL, et al. Generation of structure-guided pMHC-I libraries using diffusion models. Proc Int Conf Mach Learn 2025. arXiv:2507.08902.</w:t>
+        <w:t xml:space="preserve">Mares S, Espinoza Weinberger A, Ioannidis NM. Generation of structure-guided pMHC-I libraries using diffusion models. arXiv:2507.08902 (ICML 2025 Generative AI and Biology Workshop).</w:t>
       </w:r>
     </w:p>
     <w:p>
@@ -2480,7 +2510,7 @@
         </w:numPr>
       </w:pPr>
       <w:r>
-        <w:t xml:space="preserve">Rives A, Meier J, Sercu T, et al. Biological structure and function emerge from scaling unsupervised learning to 250 million protein sequences. Proc Natl Acad Sci USA 2021;118:e2016239118.</w:t>
+        <w:t xml:space="preserve">Henikoff S, Henikoff JG. Amino acid substitution matrices from protein blocks. Proc Natl Acad Sci USA 1992;89:10915-10919.</w:t>
       </w:r>
     </w:p>
     <w:p>
@@ -2492,7 +2522,7 @@
         </w:numPr>
       </w:pPr>
       <w:r>
-        <w:t xml:space="preserve">Preibisch J, Becker JP, Kohlbacher O. Resolution of recursive data corruption to transform T-cell epitope discovery. bioRxiv 2026.</w:t>
+        <w:t xml:space="preserve">Rives A, Meier J, Sercu T, et al. Biological structure and function emerge from scaling unsupervised learning to 250 million protein sequences. Proc Natl Acad Sci USA 2021;118:e2016239118.</w:t>
       </w:r>
     </w:p>
     <w:p>
@@ -2504,7 +2534,7 @@
         </w:numPr>
       </w:pPr>
       <w:r>
-        <w:t xml:space="preserve">Henikoff S, Henikoff JG. Amino acid substitution matrices from protein blocks. Proc Natl Acad Sci USA 1992;89:10915-10919.</w:t>
+        <w:t xml:space="preserve">Preibisch G, Tyrolski M, Kucharski P, et al. Resolution of recursive data corruption to transform T-cell epitope discovery. bioRxiv 2026.</w:t>
       </w:r>
     </w:p>
     <w:bookmarkEnd w:id="34"/>

</xml_diff>